<commit_message>
Indented previous proposal, ensure unique problem statements
</commit_message>
<xml_diff>
--- a/Reports/01-Capstone-Project-Proposal.docx
+++ b/Reports/01-Capstone-Project-Proposal.docx
@@ -187,12 +187,12 @@
           <wp:inline distB="0" distT="0" distL="0" distR="0">
             <wp:extent cx="3268417" cy="3268417"/>
             <wp:effectExtent b="0" l="0" r="0" t="0"/>
-            <wp:docPr descr="IIT Madras - Wikipedia" id="19" name="image3.png"/>
+            <wp:docPr descr="IIT Madras - Wikipedia" id="19" name="image1.png"/>
             <a:graphic>
               <a:graphicData uri="http://schemas.openxmlformats.org/drawingml/2006/picture">
                 <pic:pic>
                   <pic:nvPicPr>
-                    <pic:cNvPr descr="IIT Madras - Wikipedia" id="0" name="image3.png"/>
+                    <pic:cNvPr descr="IIT Madras - Wikipedia" id="0" name="image1.png"/>
                     <pic:cNvPicPr preferRelativeResize="0"/>
                   </pic:nvPicPr>
                   <pic:blipFill>
@@ -1938,7 +1938,7 @@
           <w:szCs w:val="24"/>
           <w:rtl w:val="0"/>
         </w:rPr>
-        <w:t xml:space="preserve">How the employment growth influences the demand for commercial and personal vehicles sales, and what infrastructure might optimize the economic activity in high-growth districts ?</w:t>
+        <w:t xml:space="preserve">How does the industrial approval timeline vary across the sectors and districts, are these delays correlated with investment size or due to the marginalized group of applicants ?</w:t>
       </w:r>
     </w:p>
     <w:p>
@@ -2458,12 +2458,12 @@
             <wp:inline distB="114300" distT="114300" distL="114300" distR="114300">
               <wp:extent cx="5452533" cy="1609965"/>
               <wp:effectExtent b="0" l="0" r="0" t="0"/>
-              <wp:docPr id="20" name="image2.jpg"/>
+              <wp:docPr id="20" name="image3.jpg"/>
               <a:graphic>
                 <a:graphicData uri="http://schemas.openxmlformats.org/drawingml/2006/picture">
                   <pic:pic>
                     <pic:nvPicPr>
-                      <pic:cNvPr id="0" name="image2.jpg"/>
+                      <pic:cNvPr id="0" name="image3.jpg"/>
                       <pic:cNvPicPr preferRelativeResize="0"/>
                     </pic:nvPicPr>
                     <pic:blipFill>
@@ -2553,12 +2553,12 @@
             <wp:inline distB="114300" distT="114300" distL="114300" distR="114300">
               <wp:extent cx="4692050" cy="2193925"/>
               <wp:effectExtent b="0" l="0" r="0" t="0"/>
-              <wp:docPr id="21" name="image1.png"/>
+              <wp:docPr id="21" name="image2.png"/>
               <a:graphic>
                 <a:graphicData uri="http://schemas.openxmlformats.org/drawingml/2006/picture">
                   <pic:pic>
                     <pic:nvPicPr>
-                      <pic:cNvPr id="0" name="image1.png"/>
+                      <pic:cNvPr id="0" name="image2.png"/>
                       <pic:cNvPicPr preferRelativeResize="0"/>
                     </pic:nvPicPr>
                     <pic:blipFill>
@@ -2684,7 +2684,7 @@
           <w:ilvl w:val="0"/>
           <w:numId w:val="4"/>
         </w:numPr>
-        <w:spacing w:after="200" w:before="240" w:line="360" w:lineRule="auto"/>
+        <w:spacing w:after="100" w:before="100" w:line="360" w:lineRule="auto"/>
         <w:ind w:left="720" w:hanging="360"/>
         <w:jc w:val="both"/>
         <w:rPr>
@@ -2709,7 +2709,7 @@
           <w:ilvl w:val="0"/>
           <w:numId w:val="4"/>
         </w:numPr>
-        <w:spacing w:after="200" w:before="240" w:line="360" w:lineRule="auto"/>
+        <w:spacing w:after="100" w:before="100" w:line="360" w:lineRule="auto"/>
         <w:ind w:left="720" w:hanging="360"/>
         <w:jc w:val="both"/>
         <w:rPr>
@@ -2734,7 +2734,7 @@
           <w:ilvl w:val="0"/>
           <w:numId w:val="4"/>
         </w:numPr>
-        <w:spacing w:after="200" w:before="240" w:line="360" w:lineRule="auto"/>
+        <w:spacing w:after="100" w:before="100" w:line="360" w:lineRule="auto"/>
         <w:ind w:left="720" w:hanging="360"/>
         <w:jc w:val="both"/>
         <w:rPr>
@@ -2759,7 +2759,7 @@
           <w:ilvl w:val="0"/>
           <w:numId w:val="4"/>
         </w:numPr>
-        <w:spacing w:after="200" w:before="240" w:line="360" w:lineRule="auto"/>
+        <w:spacing w:after="100" w:before="100" w:line="360" w:lineRule="auto"/>
         <w:ind w:left="720" w:hanging="360"/>
         <w:jc w:val="both"/>
         <w:rPr>
@@ -2784,7 +2784,7 @@
           <w:ilvl w:val="0"/>
           <w:numId w:val="4"/>
         </w:numPr>
-        <w:spacing w:after="200" w:before="240" w:line="360" w:lineRule="auto"/>
+        <w:spacing w:after="100" w:before="100" w:line="360" w:lineRule="auto"/>
         <w:ind w:left="720" w:hanging="360"/>
         <w:jc w:val="both"/>
         <w:rPr>
@@ -2809,7 +2809,7 @@
           <w:ilvl w:val="0"/>
           <w:numId w:val="4"/>
         </w:numPr>
-        <w:spacing w:after="200" w:before="240" w:line="360" w:lineRule="auto"/>
+        <w:spacing w:after="100" w:before="100" w:line="360" w:lineRule="auto"/>
         <w:ind w:left="720" w:hanging="360"/>
         <w:jc w:val="both"/>
         <w:rPr>

</xml_diff>

<commit_message>
Submission -> Proposal 13-05-2025
</commit_message>
<xml_diff>
--- a/Reports/01-Capstone-Project-Proposal.docx
+++ b/Reports/01-Capstone-Project-Proposal.docx
@@ -187,12 +187,12 @@
           <wp:inline distB="0" distT="0" distL="0" distR="0">
             <wp:extent cx="3268417" cy="3268417"/>
             <wp:effectExtent b="0" l="0" r="0" t="0"/>
-            <wp:docPr descr="IIT Madras - Wikipedia" id="19" name="image1.png"/>
+            <wp:docPr descr="IIT Madras - Wikipedia" id="35" name="image2.png"/>
             <a:graphic>
               <a:graphicData uri="http://schemas.openxmlformats.org/drawingml/2006/picture">
                 <pic:pic>
                   <pic:nvPicPr>
-                    <pic:cNvPr descr="IIT Madras - Wikipedia" id="0" name="image1.png"/>
+                    <pic:cNvPr descr="IIT Madras - Wikipedia" id="0" name="image2.png"/>
                     <pic:cNvPicPr preferRelativeResize="0"/>
                   </pic:nvPicPr>
                   <pic:blipFill>
@@ -1583,7 +1583,7 @@
           <wp:inline distB="114300" distT="114300" distL="114300" distR="114300">
             <wp:extent cx="1178544" cy="522039"/>
             <wp:effectExtent b="0" l="0" r="0" t="0"/>
-            <wp:docPr id="18" name="image4.png"/>
+            <wp:docPr id="34" name="image4.png"/>
             <a:graphic>
               <a:graphicData uri="http://schemas.openxmlformats.org/drawingml/2006/picture">
                 <pic:pic>
@@ -1653,7 +1653,7 @@
           <w:szCs w:val="24"/>
           <w:rtl w:val="0"/>
         </w:rPr>
-        <w:t xml:space="preserve">Date : 08-03-2025</w:t>
+        <w:t xml:space="preserve">Date : 13-05-2025</w:t>
       </w:r>
       <w:r>
         <w:rPr>
@@ -1697,7 +1697,7 @@
           <w:szCs w:val="24"/>
           <w:rtl w:val="0"/>
         </w:rPr>
-        <w:t xml:space="preserve">The state of Telangana has emerged as a leader in data-driven governance through Open Data Telangana, an initiative that provides access to datasets across sectors for the general public and industries. The programs like TS-iPASS streamline industrial approvals while T-Hub incubates tech innovations, and Rythu Bandhu assures farmer welfare. This dictates the state's commitments towards balancing industrial growth with its agricultural legacy.</w:t>
+        <w:t xml:space="preserve">The state of Telengana leads in data-driven governance, harmonizing the industrial growth and agrarian resilience through initiatives like Open Data Telangana, TS-iPASS and  Rythu Bandhu. Transparencies in the policies empower stakeholders to leverage datasets for equitable and sustainable development.</w:t>
       </w:r>
     </w:p>
     <w:p>
@@ -1717,7 +1717,7 @@
           <w:szCs w:val="24"/>
           <w:rtl w:val="0"/>
         </w:rPr>
-        <w:t xml:space="preserve">The purpose of this study is to comprehend how Telangana's economic growth influences its major industries, such as agriculture, manufacturing and real estate. The project aims to determine district-wise trends in investments, vehicle sales, land registrations and climate conditions; the project seeks to understand how economic progress aligns with agricultural robustness. Additionally, the study will explore disparities between urban and rural development to examine whether rapid investments are influencing climate patterns.</w:t>
+        <w:t xml:space="preserve">Despite these advancements, challenges persist in ensuring inclusive growth. The delayed approvals for small-scale enterprises might discourage local entrepreneurship and thereby limit employment rates and economic activities. The digitalization gap in the land revenue system (if existing) indicates underutilization of the digital infrastructure and hinder governance efficiency. On top of it, the erratic rainfall pattern might drive mismatched agricultural investment in mechanization could inflate the farm costs. These issues risk constraining economic inclusivity, climate resilience and might widen urban-rural division.</w:t>
       </w:r>
     </w:p>
     <w:p>
@@ -1737,7 +1737,27 @@
           <w:szCs w:val="24"/>
           <w:rtl w:val="0"/>
         </w:rPr>
-        <w:t xml:space="preserve">Through the data-driven analysis across multiple data tables, the project will provide actionable insights to the policymakers and stakeholders. The findings will help to prioritize districts for agro-processing investments, optimize infrastructure planning for high-growth urban areas and create a faster, streamlined approval process for industries. By harmonizing industrial efficiency and agricultural productivity, the study will aim to guide the government of Telangana towards inclusive growth by ensuring sustainable economic development throughout the state.</w:t>
+        <w:t xml:space="preserve">The study employs time–series analysis of industrial approval timelines, correlation between rainfall with agri-vehicle registrations, and comparative study for the e-Stamp adoption to find the trends and patterns. Python tools like Pandas and Plotly will be used for data processing of different datasets for generating district-level insights.</w:t>
+      </w:r>
+    </w:p>
+    <w:p>
+      <w:pPr>
+        <w:spacing w:after="100" w:before="100" w:line="360" w:lineRule="auto"/>
+        <w:jc w:val="both"/>
+        <w:rPr>
+          <w:rFonts w:ascii="Times New Roman" w:cs="Times New Roman" w:eastAsia="Times New Roman" w:hAnsi="Times New Roman"/>
+          <w:sz w:val="24"/>
+          <w:szCs w:val="24"/>
+        </w:rPr>
+      </w:pPr>
+      <w:r>
+        <w:rPr>
+          <w:rFonts w:ascii="Times New Roman" w:cs="Times New Roman" w:eastAsia="Times New Roman" w:hAnsi="Times New Roman"/>
+          <w:sz w:val="24"/>
+          <w:szCs w:val="24"/>
+          <w:rtl w:val="0"/>
+        </w:rPr>
+        <w:t xml:space="preserve">The expected outcomes will help to prioritize districts for fast-tracked business approvals, not just only for small-scaled ones even for the large ones, climate-aligned agricultural supports and infrastructure for farmers and scaling the digitized governance to ensure states growth balances industrial efficiency with agrarian sustainability.</w:t>
       </w:r>
     </w:p>
     <w:p>
@@ -1870,7 +1890,7 @@
       <w:pPr>
         <w:numPr>
           <w:ilvl w:val="0"/>
-          <w:numId w:val="5"/>
+          <w:numId w:val="4"/>
         </w:numPr>
         <w:spacing w:after="100" w:before="100" w:line="360" w:lineRule="auto"/>
         <w:ind w:left="720" w:hanging="360"/>
@@ -1888,14 +1908,14 @@
           <w:szCs w:val="24"/>
           <w:rtl w:val="0"/>
         </w:rPr>
-        <w:t xml:space="preserve">How can Telangana prioritize districts for agro-processing investments by increasing agricultural productivity with industrial growth and  climate resilience to maximize economic growth ?</w:t>
+        <w:t xml:space="preserve">Small investments face systemic approval delays : Smaller projects may experience disproportionately longer approval timelines compared to large-scale proposals, discouraging local entrepreneurship.</w:t>
       </w:r>
     </w:p>
     <w:p>
       <w:pPr>
         <w:numPr>
           <w:ilvl w:val="0"/>
-          <w:numId w:val="5"/>
+          <w:numId w:val="4"/>
         </w:numPr>
         <w:spacing w:after="100" w:before="100" w:line="360" w:lineRule="auto"/>
         <w:ind w:left="720" w:hanging="360"/>
@@ -1913,14 +1933,14 @@
           <w:szCs w:val="24"/>
           <w:rtl w:val="0"/>
         </w:rPr>
-        <w:t xml:space="preserve">How the employment growth influences the demand for commercial and personal vehicles sales, and what infrastructure might optimize the economic activity in high-growth districts ?</w:t>
+        <w:t xml:space="preserve">e-Stamp adoption efficiency over document registration :  Identify if digital transitions in registrations improved revenue collection efficiency for scalable governance and promoting digital inclusion. </w:t>
       </w:r>
     </w:p>
     <w:p>
       <w:pPr>
         <w:numPr>
           <w:ilvl w:val="0"/>
-          <w:numId w:val="5"/>
+          <w:numId w:val="4"/>
         </w:numPr>
         <w:spacing w:after="100" w:before="100" w:line="360" w:lineRule="auto"/>
         <w:ind w:left="720" w:hanging="360"/>
@@ -1938,7 +1958,35 @@
           <w:szCs w:val="24"/>
           <w:rtl w:val="0"/>
         </w:rPr>
-        <w:t xml:space="preserve">How does the industrial approval timeline vary across the sectors and districts, are these delays correlated with investment size or due to the marginalized group of applicants ?</w:t>
+        <w:t xml:space="preserve">Rainfall-mechanization mismatch inflates farm costs : Uneven rainfall forces over/under investments in agri-vehicles without promising irrigation infrastructure  might lead to unnecessary capital expenditure and subsidies.</w:t>
+      </w:r>
+    </w:p>
+    <w:p>
+      <w:pPr>
+        <w:ind w:left="0" w:firstLine="0"/>
+        <w:rPr>
+          <w:rFonts w:ascii="Times New Roman" w:cs="Times New Roman" w:eastAsia="Times New Roman" w:hAnsi="Times New Roman"/>
+          <w:sz w:val="24"/>
+          <w:szCs w:val="24"/>
+        </w:rPr>
+      </w:pPr>
+      <w:hyperlink r:id="rId9">
+        <w:r>
+          <w:rPr>
+            <w:rFonts w:ascii="Times New Roman" w:cs="Times New Roman" w:eastAsia="Times New Roman" w:hAnsi="Times New Roman"/>
+            <w:color w:val="1155cc"/>
+            <w:sz w:val="24"/>
+            <w:szCs w:val="24"/>
+            <w:u w:val="single"/>
+            <w:rtl w:val="0"/>
+          </w:rPr>
+          <w:t xml:space="preserve">Supporting Articles and NEWS Readings</w:t>
+        </w:r>
+      </w:hyperlink>
+      <w:r>
+        <w:rPr>
+          <w:rtl w:val="0"/>
+        </w:rPr>
       </w:r>
     </w:p>
     <w:p>
@@ -2025,7 +2073,9 @@
         <w:pStyle w:val="Heading1"/>
         <w:spacing w:after="200" w:line="360" w:lineRule="auto"/>
         <w:ind w:left="0" w:firstLine="0"/>
-        <w:rPr/>
+        <w:rPr>
+          <w:rFonts w:ascii="Times New Roman" w:cs="Times New Roman" w:eastAsia="Times New Roman" w:hAnsi="Times New Roman"/>
+        </w:rPr>
       </w:pPr>
       <w:bookmarkStart w:colFirst="0" w:colLast="0" w:name="_heading=h.1t3h5sf" w:id="4"/>
       <w:bookmarkEnd w:id="4"/>
@@ -2036,11 +2086,6 @@
         </w:rPr>
         <w:t xml:space="preserve">5. Problem Solving Approach</w:t>
       </w:r>
-      <w:r>
-        <w:rPr>
-          <w:rtl w:val="0"/>
-        </w:rPr>
-      </w:r>
     </w:p>
     <w:p>
       <w:pPr>
@@ -2059,7 +2104,7 @@
           <w:szCs w:val="24"/>
           <w:rtl w:val="0"/>
         </w:rPr>
-        <w:t xml:space="preserve">TS-iPASS was introduced for speedy processing of applications for the various clearances required for setting up industries. Even with this, we can see that not all the sectors are having the same lead time. Also the industrial areas could be the crowd pullers for the investments that are happening in the state. Being known for agricultural dominance, it is mandatory to identify climate change and socio-economic impact along the industrial growth. </w:t>
+        <w:t xml:space="preserve">This project uses data-driven methodologies to analyze systemic approval delays for large and small enterprises, digitalization gap in the land revenue and mismatched agricultural mechanization using Telengana’s district-level data from 2019 January to 2024 December. The study will utilize time series analysis and comparative analytics to derive actionable insights.</w:t>
       </w:r>
     </w:p>
     <w:p>
@@ -2068,28 +2113,269 @@
         <w:jc w:val="both"/>
         <w:rPr>
           <w:rFonts w:ascii="Times New Roman" w:cs="Times New Roman" w:eastAsia="Times New Roman" w:hAnsi="Times New Roman"/>
-          <w:sz w:val="24"/>
-          <w:szCs w:val="24"/>
-        </w:rPr>
-      </w:pPr>
-      <w:r>
-        <w:rPr>
-          <w:rFonts w:ascii="Times New Roman" w:cs="Times New Roman" w:eastAsia="Times New Roman" w:hAnsi="Times New Roman"/>
-          <w:sz w:val="24"/>
-          <w:szCs w:val="24"/>
-          <w:u w:val="single"/>
-          <w:rtl w:val="0"/>
-        </w:rPr>
-        <w:t xml:space="preserve">Methods Used </w:t>
-      </w:r>
-      <w:r>
-        <w:rPr>
-          <w:rFonts w:ascii="Times New Roman" w:cs="Times New Roman" w:eastAsia="Times New Roman" w:hAnsi="Times New Roman"/>
-          <w:sz w:val="24"/>
-          <w:szCs w:val="24"/>
-          <w:rtl w:val="0"/>
-        </w:rPr>
-        <w:t xml:space="preserve">:</w:t>
+          <w:b w:val="1"/>
+          <w:sz w:val="24"/>
+          <w:szCs w:val="24"/>
+        </w:rPr>
+      </w:pPr>
+      <w:r>
+        <w:rPr>
+          <w:rFonts w:ascii="Times New Roman" w:cs="Times New Roman" w:eastAsia="Times New Roman" w:hAnsi="Times New Roman"/>
+          <w:b w:val="1"/>
+          <w:sz w:val="24"/>
+          <w:szCs w:val="24"/>
+          <w:rtl w:val="0"/>
+        </w:rPr>
+        <w:t xml:space="preserve">Methods</w:t>
+      </w:r>
+    </w:p>
+    <w:p>
+      <w:pPr>
+        <w:spacing w:after="100" w:line="360" w:lineRule="auto"/>
+        <w:jc w:val="both"/>
+        <w:rPr>
+          <w:rFonts w:ascii="Times New Roman" w:cs="Times New Roman" w:eastAsia="Times New Roman" w:hAnsi="Times New Roman"/>
+          <w:sz w:val="24"/>
+          <w:szCs w:val="24"/>
+        </w:rPr>
+      </w:pPr>
+      <w:r>
+        <w:rPr>
+          <w:rFonts w:ascii="Times New Roman" w:cs="Times New Roman" w:eastAsia="Times New Roman" w:hAnsi="Times New Roman"/>
+          <w:sz w:val="24"/>
+          <w:szCs w:val="24"/>
+          <w:rtl w:val="0"/>
+        </w:rPr>
+        <w:t xml:space="preserve">To evaluate approval delays for enterprises, time-series analysis tracks the duration between application submission and approval across industries and demographics. Statistical methods like mean, median mode will help to identify the patterns linking delays to variables such as investment size, demographics and social status of the applicants. For digitalization efficiency, trend analysis compares manual and digital revenue streams over the time, assessing the adoption rate and the processing efficiency. To address the climate-mechanization mismatch finding, monthly correlation with rainfall patterns with agricultural registrations will be utilized. This can help us in classifying districts with profiles based on climate risks and mechanization levels. Over these, cross-cutting techniques like data integration, to merge industrial, weather and transport datasets to capture cross-sector insights such as seasonal demand spikes in agricultural machinery and change in trend in vehicle ownership can be revealed.</w:t>
+      </w:r>
+    </w:p>
+    <w:p>
+      <w:pPr>
+        <w:spacing w:after="100" w:line="360" w:lineRule="auto"/>
+        <w:jc w:val="both"/>
+        <w:rPr>
+          <w:rFonts w:ascii="Times New Roman" w:cs="Times New Roman" w:eastAsia="Times New Roman" w:hAnsi="Times New Roman"/>
+          <w:b w:val="1"/>
+          <w:sz w:val="24"/>
+          <w:szCs w:val="24"/>
+        </w:rPr>
+      </w:pPr>
+      <w:r>
+        <w:rPr>
+          <w:rFonts w:ascii="Times New Roman" w:cs="Times New Roman" w:eastAsia="Times New Roman" w:hAnsi="Times New Roman"/>
+          <w:b w:val="1"/>
+          <w:sz w:val="24"/>
+          <w:szCs w:val="24"/>
+          <w:rtl w:val="0"/>
+        </w:rPr>
+        <w:t xml:space="preserve">Data</w:t>
+      </w:r>
+    </w:p>
+    <w:p>
+      <w:pPr>
+        <w:spacing w:after="100" w:line="360" w:lineRule="auto"/>
+        <w:jc w:val="both"/>
+        <w:rPr>
+          <w:rFonts w:ascii="Times New Roman" w:cs="Times New Roman" w:eastAsia="Times New Roman" w:hAnsi="Times New Roman"/>
+          <w:sz w:val="24"/>
+          <w:szCs w:val="24"/>
+        </w:rPr>
+      </w:pPr>
+      <w:r>
+        <w:rPr>
+          <w:rFonts w:ascii="Times New Roman" w:cs="Times New Roman" w:eastAsia="Times New Roman" w:hAnsi="Times New Roman"/>
+          <w:sz w:val="24"/>
+          <w:szCs w:val="24"/>
+          <w:rtl w:val="0"/>
+        </w:rPr>
+        <w:t xml:space="preserve">The analysis relies on four key datasets:</w:t>
+      </w:r>
+    </w:p>
+    <w:p>
+      <w:pPr>
+        <w:numPr>
+          <w:ilvl w:val="0"/>
+          <w:numId w:val="1"/>
+        </w:numPr>
+        <w:spacing w:after="0" w:line="360" w:lineRule="auto"/>
+        <w:ind w:left="720" w:hanging="360"/>
+        <w:jc w:val="both"/>
+        <w:rPr>
+          <w:rFonts w:ascii="Times New Roman" w:cs="Times New Roman" w:eastAsia="Times New Roman" w:hAnsi="Times New Roman"/>
+          <w:sz w:val="24"/>
+          <w:szCs w:val="24"/>
+          <w:u w:val="none"/>
+        </w:rPr>
+      </w:pPr>
+      <w:r>
+        <w:rPr>
+          <w:rFonts w:ascii="Times New Roman" w:cs="Times New Roman" w:eastAsia="Times New Roman" w:hAnsi="Times New Roman"/>
+          <w:sz w:val="24"/>
+          <w:szCs w:val="24"/>
+          <w:rtl w:val="0"/>
+        </w:rPr>
+        <w:t xml:space="preserve">Industrial approvals: Daily records of investment applications, approvals, and applicant demographics, aggregated into monthly district-level summaries.</w:t>
+      </w:r>
+      <w:r>
+        <w:rPr>
+          <w:rtl w:val="0"/>
+        </w:rPr>
+      </w:r>
+    </w:p>
+    <w:p>
+      <w:pPr>
+        <w:numPr>
+          <w:ilvl w:val="0"/>
+          <w:numId w:val="1"/>
+        </w:numPr>
+        <w:spacing w:after="0" w:line="360" w:lineRule="auto"/>
+        <w:ind w:left="720" w:hanging="360"/>
+        <w:jc w:val="both"/>
+        <w:rPr>
+          <w:rFonts w:ascii="Times New Roman" w:cs="Times New Roman" w:eastAsia="Times New Roman" w:hAnsi="Times New Roman"/>
+          <w:sz w:val="24"/>
+          <w:szCs w:val="24"/>
+          <w:u w:val="none"/>
+        </w:rPr>
+      </w:pPr>
+      <w:r>
+        <w:rPr>
+          <w:rFonts w:ascii="Times New Roman" w:cs="Times New Roman" w:eastAsia="Times New Roman" w:hAnsi="Times New Roman"/>
+          <w:sz w:val="24"/>
+          <w:szCs w:val="24"/>
+          <w:rtl w:val="0"/>
+        </w:rPr>
+        <w:t xml:space="preserve">Weather metrics: Monthly rainfall, temperature, and humidity data for all districts.</w:t>
+      </w:r>
+      <w:r>
+        <w:rPr>
+          <w:rtl w:val="0"/>
+        </w:rPr>
+      </w:r>
+    </w:p>
+    <w:p>
+      <w:pPr>
+        <w:numPr>
+          <w:ilvl w:val="0"/>
+          <w:numId w:val="1"/>
+        </w:numPr>
+        <w:spacing w:after="0" w:line="360" w:lineRule="auto"/>
+        <w:ind w:left="720" w:hanging="360"/>
+        <w:jc w:val="both"/>
+        <w:rPr>
+          <w:rFonts w:ascii="Times New Roman" w:cs="Times New Roman" w:eastAsia="Times New Roman" w:hAnsi="Times New Roman"/>
+          <w:sz w:val="24"/>
+          <w:szCs w:val="24"/>
+          <w:u w:val="none"/>
+        </w:rPr>
+      </w:pPr>
+      <w:r>
+        <w:rPr>
+          <w:rFonts w:ascii="Times New Roman" w:cs="Times New Roman" w:eastAsia="Times New Roman" w:hAnsi="Times New Roman"/>
+          <w:sz w:val="24"/>
+          <w:szCs w:val="24"/>
+          <w:rtl w:val="0"/>
+        </w:rPr>
+        <w:t xml:space="preserve">Land registrations: Revenue and transaction counts from manual and digital processes.</w:t>
+      </w:r>
+      <w:r>
+        <w:rPr>
+          <w:rtl w:val="0"/>
+        </w:rPr>
+      </w:r>
+    </w:p>
+    <w:p>
+      <w:pPr>
+        <w:numPr>
+          <w:ilvl w:val="0"/>
+          <w:numId w:val="1"/>
+        </w:numPr>
+        <w:spacing w:after="100" w:line="360" w:lineRule="auto"/>
+        <w:ind w:left="720" w:hanging="360"/>
+        <w:jc w:val="both"/>
+        <w:rPr>
+          <w:rFonts w:ascii="Times New Roman" w:cs="Times New Roman" w:eastAsia="Times New Roman" w:hAnsi="Times New Roman"/>
+          <w:sz w:val="24"/>
+          <w:szCs w:val="24"/>
+          <w:u w:val="none"/>
+        </w:rPr>
+      </w:pPr>
+      <w:r>
+        <w:rPr>
+          <w:rFonts w:ascii="Times New Roman" w:cs="Times New Roman" w:eastAsia="Times New Roman" w:hAnsi="Times New Roman"/>
+          <w:sz w:val="24"/>
+          <w:szCs w:val="24"/>
+          <w:rtl w:val="0"/>
+        </w:rPr>
+        <w:t xml:space="preserve">Vehicle sales: Agricultural and non-agricultural vehicle registrations categorized by type, fuel, and capacity.</w:t>
+      </w:r>
+      <w:r>
+        <w:rPr>
+          <w:rtl w:val="0"/>
+        </w:rPr>
+      </w:r>
+    </w:p>
+    <w:p>
+      <w:pPr>
+        <w:spacing w:after="100" w:line="360" w:lineRule="auto"/>
+        <w:jc w:val="both"/>
+        <w:rPr>
+          <w:rFonts w:ascii="Times New Roman" w:cs="Times New Roman" w:eastAsia="Times New Roman" w:hAnsi="Times New Roman"/>
+          <w:sz w:val="24"/>
+          <w:szCs w:val="24"/>
+        </w:rPr>
+      </w:pPr>
+      <w:r>
+        <w:rPr>
+          <w:rtl w:val="0"/>
+        </w:rPr>
+      </w:r>
+    </w:p>
+    <w:p>
+      <w:pPr>
+        <w:spacing w:after="100" w:line="360" w:lineRule="auto"/>
+        <w:jc w:val="both"/>
+        <w:rPr>
+          <w:rFonts w:ascii="Times New Roman" w:cs="Times New Roman" w:eastAsia="Times New Roman" w:hAnsi="Times New Roman"/>
+          <w:b w:val="1"/>
+          <w:sz w:val="24"/>
+          <w:szCs w:val="24"/>
+        </w:rPr>
+      </w:pPr>
+      <w:r>
+        <w:rPr>
+          <w:rFonts w:ascii="Times New Roman" w:cs="Times New Roman" w:eastAsia="Times New Roman" w:hAnsi="Times New Roman"/>
+          <w:b w:val="1"/>
+          <w:sz w:val="24"/>
+          <w:szCs w:val="24"/>
+          <w:rtl w:val="0"/>
+        </w:rPr>
+        <w:t xml:space="preserve">Analysis Tools</w:t>
+      </w:r>
+    </w:p>
+    <w:p>
+      <w:pPr>
+        <w:numPr>
+          <w:ilvl w:val="0"/>
+          <w:numId w:val="2"/>
+        </w:numPr>
+        <w:spacing w:after="0" w:line="360" w:lineRule="auto"/>
+        <w:ind w:left="720" w:hanging="360"/>
+        <w:jc w:val="both"/>
+        <w:rPr>
+          <w:rFonts w:ascii="Times New Roman" w:cs="Times New Roman" w:eastAsia="Times New Roman" w:hAnsi="Times New Roman"/>
+          <w:sz w:val="24"/>
+          <w:szCs w:val="24"/>
+        </w:rPr>
+      </w:pPr>
+      <w:r>
+        <w:rPr>
+          <w:rFonts w:ascii="Times New Roman" w:cs="Times New Roman" w:eastAsia="Times New Roman" w:hAnsi="Times New Roman"/>
+          <w:sz w:val="24"/>
+          <w:szCs w:val="24"/>
+          <w:rtl w:val="0"/>
+        </w:rPr>
+        <w:t xml:space="preserve">Python with Pandas : For preliminary data processing and cleaning and analysis python might be required due to the volume of data, and Pandas can handle data more comprehensively for data cleaning.</w:t>
       </w:r>
     </w:p>
     <w:p>
@@ -2114,57 +2400,7 @@
           <w:szCs w:val="24"/>
           <w:rtl w:val="0"/>
         </w:rPr>
-        <w:t xml:space="preserve">Time Series Analysis :</w:t>
-      </w:r>
-    </w:p>
-    <w:p>
-      <w:pPr>
-        <w:numPr>
-          <w:ilvl w:val="1"/>
-          <w:numId w:val="2"/>
-        </w:numPr>
-        <w:spacing w:after="100" w:line="360" w:lineRule="auto"/>
-        <w:ind w:left="1440" w:hanging="360"/>
-        <w:jc w:val="both"/>
-        <w:rPr>
-          <w:rFonts w:ascii="Times New Roman" w:cs="Times New Roman" w:eastAsia="Times New Roman" w:hAnsi="Times New Roman"/>
-          <w:sz w:val="24"/>
-          <w:szCs w:val="24"/>
-        </w:rPr>
-      </w:pPr>
-      <w:r>
-        <w:rPr>
-          <w:rFonts w:ascii="Times New Roman" w:cs="Times New Roman" w:eastAsia="Times New Roman" w:hAnsi="Times New Roman"/>
-          <w:sz w:val="24"/>
-          <w:szCs w:val="24"/>
-          <w:rtl w:val="0"/>
-        </w:rPr>
-        <w:t xml:space="preserve">Given the time dependent nature of the problem statement, the time series analysis might help in identifying the growth in district wise investments and the climate change. </w:t>
-      </w:r>
-    </w:p>
-    <w:p>
-      <w:pPr>
-        <w:numPr>
-          <w:ilvl w:val="1"/>
-          <w:numId w:val="2"/>
-        </w:numPr>
-        <w:spacing w:after="100" w:line="360" w:lineRule="auto"/>
-        <w:ind w:left="1440" w:hanging="360"/>
-        <w:jc w:val="both"/>
-        <w:rPr>
-          <w:rFonts w:ascii="Times New Roman" w:cs="Times New Roman" w:eastAsia="Times New Roman" w:hAnsi="Times New Roman"/>
-          <w:sz w:val="24"/>
-          <w:szCs w:val="24"/>
-        </w:rPr>
-      </w:pPr>
-      <w:r>
-        <w:rPr>
-          <w:rFonts w:ascii="Times New Roman" w:cs="Times New Roman" w:eastAsia="Times New Roman" w:hAnsi="Times New Roman"/>
-          <w:sz w:val="24"/>
-          <w:szCs w:val="24"/>
-          <w:rtl w:val="0"/>
-        </w:rPr>
-        <w:t xml:space="preserve">Similarly, evaluation of the adoption of online services in  industrial registration and land registrations.</w:t>
+        <w:t xml:space="preserve">Python with Matplotlib/Seaborn : It will be useful to create visual representations, also, might use the Plotly to have interactive visual plots.</w:t>
       </w:r>
     </w:p>
     <w:p>
@@ -2182,119 +2418,9 @@
           <w:rFonts w:ascii="Times New Roman" w:cs="Times New Roman" w:eastAsia="Times New Roman" w:hAnsi="Times New Roman"/>
           <w:sz w:val="24"/>
           <w:szCs w:val="24"/>
-          <w:u w:val="single"/>
-          <w:rtl w:val="0"/>
-        </w:rPr>
-        <w:t xml:space="preserve">Intended Data </w:t>
-      </w:r>
-      <w:r>
-        <w:rPr>
-          <w:rFonts w:ascii="Times New Roman" w:cs="Times New Roman" w:eastAsia="Times New Roman" w:hAnsi="Times New Roman"/>
-          <w:sz w:val="24"/>
-          <w:szCs w:val="24"/>
-          <w:rtl w:val="0"/>
-        </w:rPr>
-        <w:t xml:space="preserve">:</w:t>
-      </w:r>
-    </w:p>
-    <w:p>
-      <w:pPr>
-        <w:numPr>
-          <w:ilvl w:val="0"/>
-          <w:numId w:val="1"/>
-        </w:numPr>
-        <w:spacing w:after="0" w:line="360" w:lineRule="auto"/>
-        <w:ind w:left="720" w:hanging="360"/>
-        <w:jc w:val="both"/>
-        <w:rPr>
-          <w:rFonts w:ascii="Times New Roman" w:cs="Times New Roman" w:eastAsia="Times New Roman" w:hAnsi="Times New Roman"/>
-          <w:sz w:val="24"/>
-          <w:szCs w:val="24"/>
-        </w:rPr>
-      </w:pPr>
-      <w:r>
-        <w:rPr>
-          <w:rFonts w:ascii="Times New Roman" w:cs="Times New Roman" w:eastAsia="Times New Roman" w:hAnsi="Times New Roman"/>
-          <w:sz w:val="24"/>
-          <w:szCs w:val="24"/>
-          <w:rtl w:val="0"/>
-        </w:rPr>
-        <w:t xml:space="preserve">TS-iPASS registration Data : Collect industrial data for district wise registrations on the portal and need at-least information about  sector, line of activity, investment amount, number of employees, application date, approval date and application mode to check whether online or offline.</w:t>
-      </w:r>
-    </w:p>
-    <w:p>
-      <w:pPr>
-        <w:numPr>
-          <w:ilvl w:val="0"/>
-          <w:numId w:val="1"/>
-        </w:numPr>
-        <w:spacing w:after="0" w:line="360" w:lineRule="auto"/>
-        <w:ind w:left="720" w:hanging="360"/>
-        <w:jc w:val="both"/>
-        <w:rPr>
-          <w:rFonts w:ascii="Times New Roman" w:cs="Times New Roman" w:eastAsia="Times New Roman" w:hAnsi="Times New Roman"/>
-          <w:sz w:val="24"/>
-          <w:szCs w:val="24"/>
-        </w:rPr>
-      </w:pPr>
-      <w:r>
-        <w:rPr>
-          <w:rFonts w:ascii="Times New Roman" w:cs="Times New Roman" w:eastAsia="Times New Roman" w:hAnsi="Times New Roman"/>
-          <w:sz w:val="24"/>
-          <w:szCs w:val="24"/>
-          <w:rtl w:val="0"/>
-        </w:rPr>
-        <w:t xml:space="preserve">Weather Data : Gather information about district wise weather reports, the data must have cumulative rainfall, minimum and maximum temperatures recorded in an interval and similarly humidity and wind speed data also.</w:t>
-      </w:r>
-    </w:p>
-    <w:p>
-      <w:pPr>
-        <w:numPr>
-          <w:ilvl w:val="0"/>
-          <w:numId w:val="1"/>
-        </w:numPr>
-        <w:spacing w:after="0" w:line="360" w:lineRule="auto"/>
-        <w:ind w:left="720" w:hanging="360"/>
-        <w:jc w:val="both"/>
-        <w:rPr>
-          <w:rFonts w:ascii="Times New Roman" w:cs="Times New Roman" w:eastAsia="Times New Roman" w:hAnsi="Times New Roman"/>
-          <w:sz w:val="24"/>
-          <w:szCs w:val="24"/>
-        </w:rPr>
-      </w:pPr>
-      <w:r>
-        <w:rPr>
-          <w:rFonts w:ascii="Times New Roman" w:cs="Times New Roman" w:eastAsia="Times New Roman" w:hAnsi="Times New Roman"/>
-          <w:sz w:val="24"/>
-          <w:szCs w:val="24"/>
-          <w:rtl w:val="0"/>
-        </w:rPr>
-        <w:t xml:space="preserve">Land Registration Data : This could help in identifying the revenue generated in each district via the land related operations. District wise document registration count and revenue from the registrations required for both offline and eChallan methods.</w:t>
-      </w:r>
-    </w:p>
-    <w:p>
-      <w:pPr>
-        <w:numPr>
-          <w:ilvl w:val="0"/>
-          <w:numId w:val="1"/>
-        </w:numPr>
-        <w:spacing w:after="100" w:line="360" w:lineRule="auto"/>
-        <w:ind w:left="720" w:hanging="360"/>
-        <w:jc w:val="both"/>
-        <w:rPr>
-          <w:rFonts w:ascii="Times New Roman" w:cs="Times New Roman" w:eastAsia="Times New Roman" w:hAnsi="Times New Roman"/>
-          <w:sz w:val="24"/>
-          <w:szCs w:val="24"/>
-        </w:rPr>
-      </w:pPr>
-      <w:r>
-        <w:rPr>
-          <w:rFonts w:ascii="Times New Roman" w:cs="Times New Roman" w:eastAsia="Times New Roman" w:hAnsi="Times New Roman"/>
-          <w:sz w:val="24"/>
-          <w:szCs w:val="24"/>
-          <w:rtl w:val="0"/>
-        </w:rPr>
-        <w:t xml:space="preserve">Vehicle Sales Data : This data set might help us in analyzing the economic activity of industrialization. To record the trend we need to have vehicle class to identify transport and non-transport, the fuel type of vehicle, make year, registration date and the information about pre-owned vehicle registration.</w:t>
+          <w:rtl w:val="0"/>
+        </w:rPr>
+        <w:t xml:space="preserve">Since we have multiple data related to multiple sectors, we have to analyze them separately. Also we have the district name or location name as common actress the data, combining them might fetch much more insights over uni-sector analysis.</w:t>
       </w:r>
     </w:p>
     <w:p>
@@ -2310,71 +2436,61 @@
       <w:r>
         <w:rPr>
           <w:rFonts w:ascii="Times New Roman" w:cs="Times New Roman" w:eastAsia="Times New Roman" w:hAnsi="Times New Roman"/>
-          <w:sz w:val="24"/>
-          <w:szCs w:val="24"/>
-          <w:u w:val="single"/>
-          <w:rtl w:val="0"/>
-        </w:rPr>
-        <w:t xml:space="preserve">Analysis Tools</w:t>
-      </w:r>
-      <w:r>
-        <w:rPr>
-          <w:rFonts w:ascii="Times New Roman" w:cs="Times New Roman" w:eastAsia="Times New Roman" w:hAnsi="Times New Roman"/>
-          <w:sz w:val="24"/>
-          <w:szCs w:val="24"/>
-          <w:rtl w:val="0"/>
-        </w:rPr>
-        <w:t xml:space="preserve"> </w:t>
-      </w:r>
-    </w:p>
-    <w:p>
-      <w:pPr>
-        <w:numPr>
-          <w:ilvl w:val="0"/>
-          <w:numId w:val="3"/>
-        </w:numPr>
-        <w:spacing w:after="0" w:line="360" w:lineRule="auto"/>
-        <w:ind w:left="720" w:hanging="360"/>
-        <w:jc w:val="both"/>
-        <w:rPr>
-          <w:rFonts w:ascii="Times New Roman" w:cs="Times New Roman" w:eastAsia="Times New Roman" w:hAnsi="Times New Roman"/>
-          <w:sz w:val="24"/>
-          <w:szCs w:val="24"/>
-        </w:rPr>
-      </w:pPr>
-      <w:r>
-        <w:rPr>
-          <w:rFonts w:ascii="Times New Roman" w:cs="Times New Roman" w:eastAsia="Times New Roman" w:hAnsi="Times New Roman"/>
-          <w:sz w:val="24"/>
-          <w:szCs w:val="24"/>
-          <w:rtl w:val="0"/>
-        </w:rPr>
-        <w:t xml:space="preserve">Python with Pandas : For preliminary data processing and cleaning and analysis python might be required due to the volume of data, and Pandas can handle data more comprehensively for data cleaning.</w:t>
-      </w:r>
-    </w:p>
-    <w:p>
-      <w:pPr>
-        <w:numPr>
-          <w:ilvl w:val="0"/>
-          <w:numId w:val="3"/>
-        </w:numPr>
-        <w:spacing w:after="100" w:line="360" w:lineRule="auto"/>
-        <w:ind w:left="720" w:hanging="360"/>
-        <w:jc w:val="both"/>
-        <w:rPr>
-          <w:rFonts w:ascii="Times New Roman" w:cs="Times New Roman" w:eastAsia="Times New Roman" w:hAnsi="Times New Roman"/>
-          <w:sz w:val="24"/>
-          <w:szCs w:val="24"/>
-        </w:rPr>
-      </w:pPr>
-      <w:r>
-        <w:rPr>
-          <w:rFonts w:ascii="Times New Roman" w:cs="Times New Roman" w:eastAsia="Times New Roman" w:hAnsi="Times New Roman"/>
-          <w:sz w:val="24"/>
-          <w:szCs w:val="24"/>
-          <w:rtl w:val="0"/>
-        </w:rPr>
-        <w:t xml:space="preserve">Python with Matplotlib/Seaborn : It will be useful to create visual representations, also, might use the Plotly to have interactive visual plots.</w:t>
+          <w:b w:val="1"/>
+          <w:sz w:val="24"/>
+          <w:szCs w:val="24"/>
+          <w:rtl w:val="0"/>
+        </w:rPr>
+        <w:t xml:space="preserve">Dataset Link</w:t>
+      </w:r>
+      <w:r>
+        <w:rPr>
+          <w:rFonts w:ascii="Times New Roman" w:cs="Times New Roman" w:eastAsia="Times New Roman" w:hAnsi="Times New Roman"/>
+          <w:sz w:val="24"/>
+          <w:szCs w:val="24"/>
+          <w:rtl w:val="0"/>
+        </w:rPr>
+        <w:t xml:space="preserve"> : </w:t>
+      </w:r>
+      <w:hyperlink r:id="rId10">
+        <w:r>
+          <w:rPr>
+            <w:rFonts w:ascii="Times New Roman" w:cs="Times New Roman" w:eastAsia="Times New Roman" w:hAnsi="Times New Roman"/>
+            <w:color w:val="1155cc"/>
+            <w:sz w:val="24"/>
+            <w:szCs w:val="24"/>
+            <w:u w:val="single"/>
+            <w:rtl w:val="0"/>
+          </w:rPr>
+          <w:t xml:space="preserve">Google Drive</w:t>
+        </w:r>
+      </w:hyperlink>
+      <w:r>
+        <w:rPr>
+          <w:rFonts w:ascii="Times New Roman" w:cs="Times New Roman" w:eastAsia="Times New Roman" w:hAnsi="Times New Roman"/>
+          <w:sz w:val="24"/>
+          <w:szCs w:val="24"/>
+          <w:rtl w:val="0"/>
+        </w:rPr>
+        <w:t xml:space="preserve"> | </w:t>
+      </w:r>
+      <w:hyperlink r:id="rId11">
+        <w:r>
+          <w:rPr>
+            <w:rFonts w:ascii="Times New Roman" w:cs="Times New Roman" w:eastAsia="Times New Roman" w:hAnsi="Times New Roman"/>
+            <w:color w:val="1155cc"/>
+            <w:sz w:val="24"/>
+            <w:szCs w:val="24"/>
+            <w:u w:val="single"/>
+            <w:rtl w:val="0"/>
+          </w:rPr>
+          <w:t xml:space="preserve">Open Data Telangana Portal</w:t>
+        </w:r>
+      </w:hyperlink>
+      <w:r>
+        <w:rPr>
+          <w:rtl w:val="0"/>
+        </w:rPr>
       </w:r>
     </w:p>
     <w:p>
@@ -2383,17 +2499,10 @@
         <w:jc w:val="both"/>
         <w:rPr>
           <w:rFonts w:ascii="Times New Roman" w:cs="Times New Roman" w:eastAsia="Times New Roman" w:hAnsi="Times New Roman"/>
-        </w:rPr>
-      </w:pPr>
-      <w:r>
-        <w:rPr>
-          <w:rFonts w:ascii="Times New Roman" w:cs="Times New Roman" w:eastAsia="Times New Roman" w:hAnsi="Times New Roman"/>
-          <w:sz w:val="24"/>
-          <w:szCs w:val="24"/>
-          <w:rtl w:val="0"/>
-        </w:rPr>
-        <w:t xml:space="preserve">Since we have multiple data related to multiple sectors, we have to analyze them separately. Also we have the district name or location name as common actress the data, combining them might fetch much more insights over uni-sector analysis.</w:t>
-      </w:r>
+          <w:sz w:val="24"/>
+          <w:szCs w:val="24"/>
+        </w:rPr>
+      </w:pPr>
       <w:r>
         <w:rPr>
           <w:rtl w:val="0"/>
@@ -2424,7 +2533,9 @@
         <w:pStyle w:val="Heading2"/>
         <w:spacing w:after="200" w:before="240" w:line="360" w:lineRule="auto"/>
         <w:ind w:left="720" w:firstLine="0"/>
-        <w:rPr/>
+        <w:rPr>
+          <w:rFonts w:ascii="Times New Roman" w:cs="Times New Roman" w:eastAsia="Times New Roman" w:hAnsi="Times New Roman"/>
+        </w:rPr>
       </w:pPr>
       <w:r>
         <w:rPr>
@@ -2432,11 +2543,6 @@
           <w:rtl w:val="0"/>
         </w:rPr>
         <w:t xml:space="preserve">6.1 Work Breakdown Structure :</w:t>
-      </w:r>
-      <w:r>
-        <w:rPr>
-          <w:rtl w:val="0"/>
-        </w:rPr>
       </w:r>
     </w:p>
     <w:p>
@@ -2447,7 +2553,7 @@
           <w:rFonts w:ascii="Times New Roman" w:cs="Times New Roman" w:eastAsia="Times New Roman" w:hAnsi="Times New Roman"/>
         </w:rPr>
       </w:pPr>
-      <w:hyperlink r:id="rId9">
+      <w:hyperlink r:id="rId12">
         <w:r>
           <w:rPr>
             <w:rFonts w:ascii="Times New Roman" w:cs="Times New Roman" w:eastAsia="Times New Roman" w:hAnsi="Times New Roman"/>
@@ -2456,18 +2562,18 @@
           </w:rPr>
           <w:drawing>
             <wp:inline distB="114300" distT="114300" distL="114300" distR="114300">
-              <wp:extent cx="5452533" cy="1609965"/>
+              <wp:extent cx="5788350" cy="1663700"/>
               <wp:effectExtent b="0" l="0" r="0" t="0"/>
-              <wp:docPr id="20" name="image3.jpg"/>
+              <wp:docPr id="36" name="image3.png"/>
               <a:graphic>
                 <a:graphicData uri="http://schemas.openxmlformats.org/drawingml/2006/picture">
                   <pic:pic>
                     <pic:nvPicPr>
-                      <pic:cNvPr id="0" name="image3.jpg"/>
+                      <pic:cNvPr id="0" name="image3.png"/>
                       <pic:cNvPicPr preferRelativeResize="0"/>
                     </pic:nvPicPr>
                     <pic:blipFill>
-                      <a:blip r:embed="rId10"/>
+                      <a:blip r:embed="rId13"/>
                       <a:srcRect b="0" l="0" r="0" t="0"/>
                       <a:stretch>
                         <a:fillRect/>
@@ -2476,7 +2582,7 @@
                     <pic:spPr>
                       <a:xfrm>
                         <a:off x="0" y="0"/>
-                        <a:ext cx="5452533" cy="1609965"/>
+                        <a:ext cx="5788350" cy="1663700"/>
                       </a:xfrm>
                       <a:prstGeom prst="rect"/>
                       <a:ln/>
@@ -2542,7 +2648,7 @@
           <w:rFonts w:ascii="Times New Roman" w:cs="Times New Roman" w:eastAsia="Times New Roman" w:hAnsi="Times New Roman"/>
         </w:rPr>
       </w:pPr>
-      <w:hyperlink r:id="rId11">
+      <w:hyperlink r:id="rId14">
         <w:r>
           <w:rPr>
             <w:rFonts w:ascii="Times New Roman" w:cs="Times New Roman" w:eastAsia="Times New Roman" w:hAnsi="Times New Roman"/>
@@ -2551,18 +2657,18 @@
           </w:rPr>
           <w:drawing>
             <wp:inline distB="114300" distT="114300" distL="114300" distR="114300">
-              <wp:extent cx="4692050" cy="2193925"/>
+              <wp:extent cx="5788350" cy="2705100"/>
               <wp:effectExtent b="0" l="0" r="0" t="0"/>
-              <wp:docPr id="21" name="image2.png"/>
+              <wp:docPr id="37" name="image1.png"/>
               <a:graphic>
                 <a:graphicData uri="http://schemas.openxmlformats.org/drawingml/2006/picture">
                   <pic:pic>
                     <pic:nvPicPr>
-                      <pic:cNvPr id="0" name="image2.png"/>
+                      <pic:cNvPr id="0" name="image1.png"/>
                       <pic:cNvPicPr preferRelativeResize="0"/>
                     </pic:nvPicPr>
                     <pic:blipFill>
-                      <a:blip r:embed="rId12"/>
+                      <a:blip r:embed="rId15"/>
                       <a:srcRect b="0" l="0" r="0" t="0"/>
                       <a:stretch>
                         <a:fillRect/>
@@ -2571,7 +2677,7 @@
                     <pic:spPr>
                       <a:xfrm>
                         <a:off x="0" y="0"/>
-                        <a:ext cx="4692050" cy="2193925"/>
+                        <a:ext cx="5788350" cy="2705100"/>
                       </a:xfrm>
                       <a:prstGeom prst="rect"/>
                       <a:ln/>
@@ -2608,11 +2714,6 @@
         <w:jc w:val="center"/>
         <w:rPr>
           <w:rFonts w:ascii="Times New Roman" w:cs="Times New Roman" w:eastAsia="Times New Roman" w:hAnsi="Times New Roman"/>
-        </w:rPr>
-      </w:pPr>
-      <w:r>
-        <w:rPr>
-          <w:rFonts w:ascii="Times New Roman" w:cs="Times New Roman" w:eastAsia="Times New Roman" w:hAnsi="Times New Roman"/>
           <w:i w:val="1"/>
           <w:smallCaps w:val="0"/>
           <w:strike w:val="0"/>
@@ -2621,20 +2722,8 @@
           <w:u w:val="none"/>
           <w:shd w:fill="auto" w:val="clear"/>
           <w:vertAlign w:val="baseline"/>
-          <w:rtl w:val="0"/>
-        </w:rPr>
-        <w:t xml:space="preserve">Figure </w:t>
-      </w:r>
-      <w:r>
-        <w:rPr>
-          <w:rFonts w:ascii="Times New Roman" w:cs="Times New Roman" w:eastAsia="Times New Roman" w:hAnsi="Times New Roman"/>
-          <w:i w:val="1"/>
-          <w:sz w:val="18"/>
-          <w:szCs w:val="18"/>
-          <w:rtl w:val="0"/>
-        </w:rPr>
-        <w:t xml:space="preserve">2</w:t>
-      </w:r>
+        </w:rPr>
+      </w:pPr>
       <w:r>
         <w:rPr>
           <w:rFonts w:ascii="Times New Roman" w:cs="Times New Roman" w:eastAsia="Times New Roman" w:hAnsi="Times New Roman"/>
@@ -2648,8 +2737,58 @@
           <w:vertAlign w:val="baseline"/>
           <w:rtl w:val="0"/>
         </w:rPr>
+        <w:t xml:space="preserve">Figure </w:t>
+      </w:r>
+      <w:r>
+        <w:rPr>
+          <w:rFonts w:ascii="Times New Roman" w:cs="Times New Roman" w:eastAsia="Times New Roman" w:hAnsi="Times New Roman"/>
+          <w:i w:val="1"/>
+          <w:sz w:val="18"/>
+          <w:szCs w:val="18"/>
+          <w:rtl w:val="0"/>
+        </w:rPr>
+        <w:t xml:space="preserve">2</w:t>
+      </w:r>
+      <w:r>
+        <w:rPr>
+          <w:rFonts w:ascii="Times New Roman" w:cs="Times New Roman" w:eastAsia="Times New Roman" w:hAnsi="Times New Roman"/>
+          <w:i w:val="1"/>
+          <w:smallCaps w:val="0"/>
+          <w:strike w:val="0"/>
+          <w:sz w:val="18"/>
+          <w:szCs w:val="18"/>
+          <w:u w:val="none"/>
+          <w:shd w:fill="auto" w:val="clear"/>
+          <w:vertAlign w:val="baseline"/>
+          <w:rtl w:val="0"/>
+        </w:rPr>
         <w:t xml:space="preserve"> Expected timeline for completion of project.</w:t>
       </w:r>
+    </w:p>
+    <w:p>
+      <w:pPr>
+        <w:keepNext w:val="0"/>
+        <w:keepLines w:val="0"/>
+        <w:pageBreakBefore w:val="0"/>
+        <w:widowControl w:val="1"/>
+        <w:pBdr>
+          <w:top w:space="0" w:sz="0" w:val="nil"/>
+          <w:left w:space="0" w:sz="0" w:val="nil"/>
+          <w:bottom w:space="0" w:sz="0" w:val="nil"/>
+          <w:right w:space="0" w:sz="0" w:val="nil"/>
+          <w:between w:space="0" w:sz="0" w:val="nil"/>
+        </w:pBdr>
+        <w:shd w:fill="auto" w:val="clear"/>
+        <w:spacing w:after="240" w:before="200" w:line="360" w:lineRule="auto"/>
+        <w:ind w:left="0" w:right="0" w:firstLine="0"/>
+        <w:jc w:val="center"/>
+        <w:rPr>
+          <w:rFonts w:ascii="Times New Roman" w:cs="Times New Roman" w:eastAsia="Times New Roman" w:hAnsi="Times New Roman"/>
+          <w:i w:val="1"/>
+          <w:sz w:val="18"/>
+          <w:szCs w:val="18"/>
+        </w:rPr>
+      </w:pPr>
       <w:r>
         <w:rPr>
           <w:rtl w:val="0"/>
@@ -2661,7 +2800,9 @@
         <w:pStyle w:val="Heading1"/>
         <w:spacing w:after="200" w:line="360" w:lineRule="auto"/>
         <w:ind w:left="0" w:firstLine="0"/>
-        <w:rPr/>
+        <w:rPr>
+          <w:rFonts w:ascii="Times New Roman" w:cs="Times New Roman" w:eastAsia="Times New Roman" w:hAnsi="Times New Roman"/>
+        </w:rPr>
       </w:pPr>
       <w:bookmarkStart w:colFirst="0" w:colLast="0" w:name="_heading=h.2s8eyo1" w:id="6"/>
       <w:bookmarkEnd w:id="6"/>
@@ -2672,17 +2813,12 @@
         </w:rPr>
         <w:t xml:space="preserve">7. Expected Outcome</w:t>
       </w:r>
-      <w:r>
-        <w:rPr>
-          <w:rtl w:val="0"/>
-        </w:rPr>
-      </w:r>
     </w:p>
     <w:p>
       <w:pPr>
         <w:numPr>
           <w:ilvl w:val="0"/>
-          <w:numId w:val="4"/>
+          <w:numId w:val="3"/>
         </w:numPr>
         <w:spacing w:after="100" w:before="100" w:line="360" w:lineRule="auto"/>
         <w:ind w:left="720" w:hanging="360"/>
@@ -2707,7 +2843,7 @@
       <w:pPr>
         <w:numPr>
           <w:ilvl w:val="0"/>
-          <w:numId w:val="4"/>
+          <w:numId w:val="3"/>
         </w:numPr>
         <w:spacing w:after="100" w:before="100" w:line="360" w:lineRule="auto"/>
         <w:ind w:left="720" w:hanging="360"/>
@@ -2732,7 +2868,7 @@
       <w:pPr>
         <w:numPr>
           <w:ilvl w:val="0"/>
-          <w:numId w:val="4"/>
+          <w:numId w:val="3"/>
         </w:numPr>
         <w:spacing w:after="100" w:before="100" w:line="360" w:lineRule="auto"/>
         <w:ind w:left="720" w:hanging="360"/>
@@ -2757,7 +2893,7 @@
       <w:pPr>
         <w:numPr>
           <w:ilvl w:val="0"/>
-          <w:numId w:val="4"/>
+          <w:numId w:val="3"/>
         </w:numPr>
         <w:spacing w:after="100" w:before="100" w:line="360" w:lineRule="auto"/>
         <w:ind w:left="720" w:hanging="360"/>
@@ -2782,7 +2918,7 @@
       <w:pPr>
         <w:numPr>
           <w:ilvl w:val="0"/>
-          <w:numId w:val="4"/>
+          <w:numId w:val="3"/>
         </w:numPr>
         <w:spacing w:after="100" w:before="100" w:line="360" w:lineRule="auto"/>
         <w:ind w:left="720" w:hanging="360"/>
@@ -2807,7 +2943,7 @@
       <w:pPr>
         <w:numPr>
           <w:ilvl w:val="0"/>
-          <w:numId w:val="4"/>
+          <w:numId w:val="3"/>
         </w:numPr>
         <w:spacing w:after="100" w:before="100" w:line="360" w:lineRule="auto"/>
         <w:ind w:left="720" w:hanging="360"/>
@@ -2828,9 +2964,37 @@
         <w:t xml:space="preserve">Identify the sectors and business activities that are facing longest approval delays, investigate links to investment size and district specificity.</w:t>
       </w:r>
     </w:p>
+    <w:p>
+      <w:pPr>
+        <w:rPr>
+          <w:rFonts w:ascii="Times New Roman" w:cs="Times New Roman" w:eastAsia="Times New Roman" w:hAnsi="Times New Roman"/>
+        </w:rPr>
+      </w:pPr>
+      <w:r>
+        <w:rPr>
+          <w:rtl w:val="0"/>
+        </w:rPr>
+      </w:r>
+    </w:p>
+    <w:p>
+      <w:pPr>
+        <w:spacing w:after="100" w:before="100" w:line="360" w:lineRule="auto"/>
+        <w:jc w:val="both"/>
+        <w:rPr>
+          <w:rFonts w:ascii="Times New Roman" w:cs="Times New Roman" w:eastAsia="Times New Roman" w:hAnsi="Times New Roman"/>
+          <w:sz w:val="24"/>
+          <w:szCs w:val="24"/>
+        </w:rPr>
+      </w:pPr>
+      <w:r>
+        <w:rPr>
+          <w:rtl w:val="0"/>
+        </w:rPr>
+      </w:r>
+    </w:p>
     <w:sectPr>
-      <w:footerReference r:id="rId13" w:type="default"/>
-      <w:footerReference r:id="rId14" w:type="first"/>
+      <w:footerReference r:id="rId16" w:type="default"/>
+      <w:footerReference r:id="rId17" w:type="first"/>
       <w:pgSz w:h="16838" w:w="11906" w:orient="portrait"/>
       <w:pgMar w:bottom="1440" w:top="1440" w:left="1350" w:right="1440" w:header="708" w:footer="708"/>
       <w:pgNumType w:start="0"/>
@@ -2952,8 +3116,8 @@
   <w:abstractNum w:abstractNumId="1">
     <w:lvl w:ilvl="0">
       <w:start w:val="1"/>
-      <w:numFmt w:val="bullet"/>
-      <w:lvlText w:val="●"/>
+      <w:numFmt w:val="decimal"/>
+      <w:lvlText w:val="%1."/>
       <w:lvlJc w:val="left"/>
       <w:pPr>
         <w:ind w:left="720" w:hanging="360"/>
@@ -2964,8 +3128,8 @@
     </w:lvl>
     <w:lvl w:ilvl="1">
       <w:start w:val="1"/>
-      <w:numFmt w:val="bullet"/>
-      <w:lvlText w:val="○"/>
+      <w:numFmt w:val="lowerLetter"/>
+      <w:lvlText w:val="%2."/>
       <w:lvlJc w:val="left"/>
       <w:pPr>
         <w:ind w:left="1440" w:hanging="360"/>
@@ -2976,9 +3140,9 @@
     </w:lvl>
     <w:lvl w:ilvl="2">
       <w:start w:val="1"/>
-      <w:numFmt w:val="bullet"/>
-      <w:lvlText w:val="■"/>
-      <w:lvlJc w:val="left"/>
+      <w:numFmt w:val="lowerRoman"/>
+      <w:lvlText w:val="%3."/>
+      <w:lvlJc w:val="right"/>
       <w:pPr>
         <w:ind w:left="2160" w:hanging="360"/>
       </w:pPr>
@@ -2988,8 +3152,8 @@
     </w:lvl>
     <w:lvl w:ilvl="3">
       <w:start w:val="1"/>
-      <w:numFmt w:val="bullet"/>
-      <w:lvlText w:val="●"/>
+      <w:numFmt w:val="decimal"/>
+      <w:lvlText w:val="%4."/>
       <w:lvlJc w:val="left"/>
       <w:pPr>
         <w:ind w:left="2880" w:hanging="360"/>
@@ -3000,8 +3164,8 @@
     </w:lvl>
     <w:lvl w:ilvl="4">
       <w:start w:val="1"/>
-      <w:numFmt w:val="bullet"/>
-      <w:lvlText w:val="○"/>
+      <w:numFmt w:val="lowerLetter"/>
+      <w:lvlText w:val="%5."/>
       <w:lvlJc w:val="left"/>
       <w:pPr>
         <w:ind w:left="3600" w:hanging="360"/>
@@ -3012,9 +3176,9 @@
     </w:lvl>
     <w:lvl w:ilvl="5">
       <w:start w:val="1"/>
-      <w:numFmt w:val="bullet"/>
-      <w:lvlText w:val="■"/>
-      <w:lvlJc w:val="left"/>
+      <w:numFmt w:val="lowerRoman"/>
+      <w:lvlText w:val="%6."/>
+      <w:lvlJc w:val="right"/>
       <w:pPr>
         <w:ind w:left="4320" w:hanging="360"/>
       </w:pPr>
@@ -3024,8 +3188,8 @@
     </w:lvl>
     <w:lvl w:ilvl="6">
       <w:start w:val="1"/>
-      <w:numFmt w:val="bullet"/>
-      <w:lvlText w:val="●"/>
+      <w:numFmt w:val="decimal"/>
+      <w:lvlText w:val="%7."/>
       <w:lvlJc w:val="left"/>
       <w:pPr>
         <w:ind w:left="5040" w:hanging="360"/>
@@ -3036,8 +3200,8 @@
     </w:lvl>
     <w:lvl w:ilvl="7">
       <w:start w:val="1"/>
-      <w:numFmt w:val="bullet"/>
-      <w:lvlText w:val="○"/>
+      <w:numFmt w:val="lowerLetter"/>
+      <w:lvlText w:val="%8."/>
       <w:lvlJc w:val="left"/>
       <w:pPr>
         <w:ind w:left="5760" w:hanging="360"/>
@@ -3048,9 +3212,9 @@
     </w:lvl>
     <w:lvl w:ilvl="8">
       <w:start w:val="1"/>
-      <w:numFmt w:val="bullet"/>
-      <w:lvlText w:val="■"/>
-      <w:lvlJc w:val="left"/>
+      <w:numFmt w:val="lowerRoman"/>
+      <w:lvlText w:val="%9."/>
+      <w:lvlJc w:val="right"/>
       <w:pPr>
         <w:ind w:left="6480" w:hanging="360"/>
       </w:pPr>
@@ -3280,116 +3444,6 @@
     </w:lvl>
   </w:abstractNum>
   <w:abstractNum w:abstractNumId="4">
-    <w:lvl w:ilvl="0">
-      <w:start w:val="1"/>
-      <w:numFmt w:val="bullet"/>
-      <w:lvlText w:val="●"/>
-      <w:lvlJc w:val="left"/>
-      <w:pPr>
-        <w:ind w:left="720" w:hanging="360"/>
-      </w:pPr>
-      <w:rPr>
-        <w:u w:val="none"/>
-      </w:rPr>
-    </w:lvl>
-    <w:lvl w:ilvl="1">
-      <w:start w:val="1"/>
-      <w:numFmt w:val="bullet"/>
-      <w:lvlText w:val="○"/>
-      <w:lvlJc w:val="left"/>
-      <w:pPr>
-        <w:ind w:left="1440" w:hanging="360"/>
-      </w:pPr>
-      <w:rPr>
-        <w:u w:val="none"/>
-      </w:rPr>
-    </w:lvl>
-    <w:lvl w:ilvl="2">
-      <w:start w:val="1"/>
-      <w:numFmt w:val="bullet"/>
-      <w:lvlText w:val="■"/>
-      <w:lvlJc w:val="left"/>
-      <w:pPr>
-        <w:ind w:left="2160" w:hanging="360"/>
-      </w:pPr>
-      <w:rPr>
-        <w:u w:val="none"/>
-      </w:rPr>
-    </w:lvl>
-    <w:lvl w:ilvl="3">
-      <w:start w:val="1"/>
-      <w:numFmt w:val="bullet"/>
-      <w:lvlText w:val="●"/>
-      <w:lvlJc w:val="left"/>
-      <w:pPr>
-        <w:ind w:left="2880" w:hanging="360"/>
-      </w:pPr>
-      <w:rPr>
-        <w:u w:val="none"/>
-      </w:rPr>
-    </w:lvl>
-    <w:lvl w:ilvl="4">
-      <w:start w:val="1"/>
-      <w:numFmt w:val="bullet"/>
-      <w:lvlText w:val="○"/>
-      <w:lvlJc w:val="left"/>
-      <w:pPr>
-        <w:ind w:left="3600" w:hanging="360"/>
-      </w:pPr>
-      <w:rPr>
-        <w:u w:val="none"/>
-      </w:rPr>
-    </w:lvl>
-    <w:lvl w:ilvl="5">
-      <w:start w:val="1"/>
-      <w:numFmt w:val="bullet"/>
-      <w:lvlText w:val="■"/>
-      <w:lvlJc w:val="left"/>
-      <w:pPr>
-        <w:ind w:left="4320" w:hanging="360"/>
-      </w:pPr>
-      <w:rPr>
-        <w:u w:val="none"/>
-      </w:rPr>
-    </w:lvl>
-    <w:lvl w:ilvl="6">
-      <w:start w:val="1"/>
-      <w:numFmt w:val="bullet"/>
-      <w:lvlText w:val="●"/>
-      <w:lvlJc w:val="left"/>
-      <w:pPr>
-        <w:ind w:left="5040" w:hanging="360"/>
-      </w:pPr>
-      <w:rPr>
-        <w:u w:val="none"/>
-      </w:rPr>
-    </w:lvl>
-    <w:lvl w:ilvl="7">
-      <w:start w:val="1"/>
-      <w:numFmt w:val="bullet"/>
-      <w:lvlText w:val="○"/>
-      <w:lvlJc w:val="left"/>
-      <w:pPr>
-        <w:ind w:left="5760" w:hanging="360"/>
-      </w:pPr>
-      <w:rPr>
-        <w:u w:val="none"/>
-      </w:rPr>
-    </w:lvl>
-    <w:lvl w:ilvl="8">
-      <w:start w:val="1"/>
-      <w:numFmt w:val="bullet"/>
-      <w:lvlText w:val="■"/>
-      <w:lvlJc w:val="left"/>
-      <w:pPr>
-        <w:ind w:left="6480" w:hanging="360"/>
-      </w:pPr>
-      <w:rPr>
-        <w:u w:val="none"/>
-      </w:rPr>
-    </w:lvl>
-  </w:abstractNum>
-  <w:abstractNum w:abstractNumId="5">
     <w:lvl w:ilvl="0">
       <w:start w:val="1"/>
       <w:numFmt w:val="decimal"/>
@@ -3511,9 +3565,6 @@
   <w:num w:numId="4">
     <w:abstractNumId w:val="4"/>
   </w:num>
-  <w:num w:numId="5">
-    <w:abstractNumId w:val="5"/>
-  </w:num>
 </w:numbering>
 </file>
 
@@ -4226,6 +4277,458 @@
       <w:keepNext w:val="1"/>
       <w:keepLines w:val="1"/>
       <w:spacing w:after="0" w:before="240" w:lineRule="auto"/>
+    </w:pPr>
+    <w:rPr>
+      <w:rFonts w:ascii="Calibri" w:cs="Calibri" w:eastAsia="Calibri" w:hAnsi="Calibri"/>
+      <w:b w:val="1"/>
+      <w:sz w:val="32"/>
+      <w:szCs w:val="32"/>
+    </w:rPr>
+  </w:style>
+  <w:style w:type="paragraph" w:styleId="Heading2">
+    <w:name w:val="heading 2"/>
+    <w:basedOn w:val="Normal"/>
+    <w:next w:val="Normal"/>
+    <w:pPr>
+      <w:keepNext w:val="1"/>
+      <w:keepLines w:val="1"/>
+      <w:spacing w:after="0" w:before="40" w:lineRule="auto"/>
+    </w:pPr>
+    <w:rPr>
+      <w:rFonts w:ascii="Calibri" w:cs="Calibri" w:eastAsia="Calibri" w:hAnsi="Calibri"/>
+      <w:color w:val="000000"/>
+      <w:sz w:val="24"/>
+      <w:szCs w:val="24"/>
+    </w:rPr>
+  </w:style>
+  <w:style w:type="paragraph" w:styleId="Heading3">
+    <w:name w:val="heading 3"/>
+    <w:basedOn w:val="Normal"/>
+    <w:next w:val="Normal"/>
+    <w:pPr>
+      <w:keepNext w:val="1"/>
+      <w:keepLines w:val="1"/>
+      <w:spacing w:after="0" w:before="40" w:lineRule="auto"/>
+    </w:pPr>
+    <w:rPr>
+      <w:rFonts w:ascii="Calibri" w:cs="Calibri" w:eastAsia="Calibri" w:hAnsi="Calibri"/>
+      <w:color w:val="1f3863"/>
+      <w:sz w:val="24"/>
+      <w:szCs w:val="24"/>
+    </w:rPr>
+  </w:style>
+  <w:style w:type="paragraph" w:styleId="Heading4">
+    <w:name w:val="heading 4"/>
+    <w:basedOn w:val="Normal"/>
+    <w:next w:val="Normal"/>
+    <w:pPr>
+      <w:keepNext w:val="1"/>
+      <w:keepLines w:val="1"/>
+      <w:spacing w:after="0" w:before="40" w:lineRule="auto"/>
+    </w:pPr>
+    <w:rPr>
+      <w:rFonts w:ascii="Calibri" w:cs="Calibri" w:eastAsia="Calibri" w:hAnsi="Calibri"/>
+      <w:i w:val="1"/>
+      <w:color w:val="2f5496"/>
+    </w:rPr>
+  </w:style>
+  <w:style w:type="paragraph" w:styleId="Heading5">
+    <w:name w:val="heading 5"/>
+    <w:basedOn w:val="Normal"/>
+    <w:next w:val="Normal"/>
+    <w:pPr>
+      <w:keepNext w:val="1"/>
+      <w:keepLines w:val="1"/>
+      <w:spacing w:after="0" w:before="40" w:lineRule="auto"/>
+    </w:pPr>
+    <w:rPr>
+      <w:rFonts w:ascii="Calibri" w:cs="Calibri" w:eastAsia="Calibri" w:hAnsi="Calibri"/>
+      <w:color w:val="2f5496"/>
+    </w:rPr>
+  </w:style>
+  <w:style w:type="paragraph" w:styleId="Heading6">
+    <w:name w:val="heading 6"/>
+    <w:basedOn w:val="Normal"/>
+    <w:next w:val="Normal"/>
+    <w:pPr>
+      <w:keepNext w:val="1"/>
+      <w:keepLines w:val="1"/>
+      <w:spacing w:after="0" w:before="40" w:lineRule="auto"/>
+    </w:pPr>
+    <w:rPr>
+      <w:rFonts w:ascii="Calibri" w:cs="Calibri" w:eastAsia="Calibri" w:hAnsi="Calibri"/>
+      <w:color w:val="1f3863"/>
+    </w:rPr>
+  </w:style>
+  <w:style w:type="paragraph" w:styleId="Title">
+    <w:name w:val="Title"/>
+    <w:basedOn w:val="Normal"/>
+    <w:next w:val="Normal"/>
+    <w:pPr>
+      <w:keepNext w:val="1"/>
+      <w:keepLines w:val="1"/>
+      <w:pageBreakBefore w:val="0"/>
+      <w:spacing w:after="120" w:before="480" w:lineRule="auto"/>
+    </w:pPr>
+    <w:rPr>
+      <w:b w:val="1"/>
+      <w:sz w:val="72"/>
+      <w:szCs w:val="72"/>
+    </w:rPr>
+  </w:style>
+  <w:style w:type="paragraph" w:styleId="Normal" w:default="1">
+    <w:name w:val="normal"/>
+  </w:style>
+  <w:style w:type="table" w:styleId="TableNormal" w:default="1">
+    <w:name w:val="Table Normal"/>
+  </w:style>
+  <w:style w:type="paragraph" w:styleId="Heading1">
+    <w:name w:val="heading 1"/>
+    <w:basedOn w:val="Normal"/>
+    <w:next w:val="Normal"/>
+    <w:pPr>
+      <w:keepNext w:val="1"/>
+      <w:keepLines w:val="1"/>
+      <w:spacing w:after="0" w:before="240" w:lineRule="auto"/>
+    </w:pPr>
+    <w:rPr>
+      <w:rFonts w:ascii="Calibri" w:cs="Calibri" w:eastAsia="Calibri" w:hAnsi="Calibri"/>
+      <w:b w:val="1"/>
+      <w:sz w:val="32"/>
+      <w:szCs w:val="32"/>
+    </w:rPr>
+  </w:style>
+  <w:style w:type="paragraph" w:styleId="Heading2">
+    <w:name w:val="heading 2"/>
+    <w:basedOn w:val="Normal"/>
+    <w:next w:val="Normal"/>
+    <w:pPr>
+      <w:keepNext w:val="1"/>
+      <w:keepLines w:val="1"/>
+      <w:spacing w:after="0" w:before="40" w:lineRule="auto"/>
+    </w:pPr>
+    <w:rPr>
+      <w:rFonts w:ascii="Calibri" w:cs="Calibri" w:eastAsia="Calibri" w:hAnsi="Calibri"/>
+      <w:color w:val="000000"/>
+      <w:sz w:val="24"/>
+      <w:szCs w:val="24"/>
+    </w:rPr>
+  </w:style>
+  <w:style w:type="paragraph" w:styleId="Heading3">
+    <w:name w:val="heading 3"/>
+    <w:basedOn w:val="Normal"/>
+    <w:next w:val="Normal"/>
+    <w:pPr>
+      <w:keepNext w:val="1"/>
+      <w:keepLines w:val="1"/>
+      <w:spacing w:after="0" w:before="40" w:lineRule="auto"/>
+    </w:pPr>
+    <w:rPr>
+      <w:rFonts w:ascii="Calibri" w:cs="Calibri" w:eastAsia="Calibri" w:hAnsi="Calibri"/>
+      <w:color w:val="1f3863"/>
+      <w:sz w:val="24"/>
+      <w:szCs w:val="24"/>
+    </w:rPr>
+  </w:style>
+  <w:style w:type="paragraph" w:styleId="Heading4">
+    <w:name w:val="heading 4"/>
+    <w:basedOn w:val="Normal"/>
+    <w:next w:val="Normal"/>
+    <w:pPr>
+      <w:keepNext w:val="1"/>
+      <w:keepLines w:val="1"/>
+      <w:spacing w:after="0" w:before="40" w:lineRule="auto"/>
+    </w:pPr>
+    <w:rPr>
+      <w:rFonts w:ascii="Calibri" w:cs="Calibri" w:eastAsia="Calibri" w:hAnsi="Calibri"/>
+      <w:i w:val="1"/>
+      <w:color w:val="2f5496"/>
+    </w:rPr>
+  </w:style>
+  <w:style w:type="paragraph" w:styleId="Heading5">
+    <w:name w:val="heading 5"/>
+    <w:basedOn w:val="Normal"/>
+    <w:next w:val="Normal"/>
+    <w:pPr>
+      <w:keepNext w:val="1"/>
+      <w:keepLines w:val="1"/>
+      <w:spacing w:after="0" w:before="40" w:lineRule="auto"/>
+    </w:pPr>
+    <w:rPr>
+      <w:rFonts w:ascii="Calibri" w:cs="Calibri" w:eastAsia="Calibri" w:hAnsi="Calibri"/>
+      <w:color w:val="2f5496"/>
+    </w:rPr>
+  </w:style>
+  <w:style w:type="paragraph" w:styleId="Heading6">
+    <w:name w:val="heading 6"/>
+    <w:basedOn w:val="Normal"/>
+    <w:next w:val="Normal"/>
+    <w:pPr>
+      <w:keepNext w:val="1"/>
+      <w:keepLines w:val="1"/>
+      <w:spacing w:after="0" w:before="40" w:lineRule="auto"/>
+    </w:pPr>
+    <w:rPr>
+      <w:rFonts w:ascii="Calibri" w:cs="Calibri" w:eastAsia="Calibri" w:hAnsi="Calibri"/>
+      <w:color w:val="1f3863"/>
+    </w:rPr>
+  </w:style>
+  <w:style w:type="paragraph" w:styleId="Title">
+    <w:name w:val="Title"/>
+    <w:basedOn w:val="Normal"/>
+    <w:next w:val="Normal"/>
+    <w:pPr>
+      <w:keepNext w:val="1"/>
+      <w:keepLines w:val="1"/>
+      <w:pageBreakBefore w:val="0"/>
+      <w:spacing w:after="120" w:before="480" w:lineRule="auto"/>
+    </w:pPr>
+    <w:rPr>
+      <w:b w:val="1"/>
+      <w:sz w:val="72"/>
+      <w:szCs w:val="72"/>
+    </w:rPr>
+  </w:style>
+  <w:style w:type="paragraph" w:styleId="Normal" w:default="1">
+    <w:name w:val="normal"/>
+  </w:style>
+  <w:style w:type="table" w:styleId="TableNormal" w:default="1">
+    <w:name w:val="Table Normal"/>
+  </w:style>
+  <w:style w:type="paragraph" w:styleId="Heading1">
+    <w:name w:val="heading 1"/>
+    <w:basedOn w:val="Normal"/>
+    <w:next w:val="Normal"/>
+    <w:pPr>
+      <w:keepNext w:val="1"/>
+      <w:keepLines w:val="1"/>
+      <w:spacing w:after="0" w:before="240" w:lineRule="auto"/>
+    </w:pPr>
+    <w:rPr>
+      <w:rFonts w:ascii="Calibri" w:cs="Calibri" w:eastAsia="Calibri" w:hAnsi="Calibri"/>
+      <w:b w:val="1"/>
+      <w:sz w:val="32"/>
+      <w:szCs w:val="32"/>
+    </w:rPr>
+  </w:style>
+  <w:style w:type="paragraph" w:styleId="Heading2">
+    <w:name w:val="heading 2"/>
+    <w:basedOn w:val="Normal"/>
+    <w:next w:val="Normal"/>
+    <w:pPr>
+      <w:keepNext w:val="1"/>
+      <w:keepLines w:val="1"/>
+      <w:spacing w:after="0" w:before="40" w:lineRule="auto"/>
+    </w:pPr>
+    <w:rPr>
+      <w:rFonts w:ascii="Calibri" w:cs="Calibri" w:eastAsia="Calibri" w:hAnsi="Calibri"/>
+      <w:color w:val="000000"/>
+      <w:sz w:val="24"/>
+      <w:szCs w:val="24"/>
+    </w:rPr>
+  </w:style>
+  <w:style w:type="paragraph" w:styleId="Heading3">
+    <w:name w:val="heading 3"/>
+    <w:basedOn w:val="Normal"/>
+    <w:next w:val="Normal"/>
+    <w:pPr>
+      <w:keepNext w:val="1"/>
+      <w:keepLines w:val="1"/>
+      <w:spacing w:after="0" w:before="40" w:lineRule="auto"/>
+    </w:pPr>
+    <w:rPr>
+      <w:rFonts w:ascii="Calibri" w:cs="Calibri" w:eastAsia="Calibri" w:hAnsi="Calibri"/>
+      <w:color w:val="1f3863"/>
+      <w:sz w:val="24"/>
+      <w:szCs w:val="24"/>
+    </w:rPr>
+  </w:style>
+  <w:style w:type="paragraph" w:styleId="Heading4">
+    <w:name w:val="heading 4"/>
+    <w:basedOn w:val="Normal"/>
+    <w:next w:val="Normal"/>
+    <w:pPr>
+      <w:keepNext w:val="1"/>
+      <w:keepLines w:val="1"/>
+      <w:spacing w:after="0" w:before="40" w:lineRule="auto"/>
+    </w:pPr>
+    <w:rPr>
+      <w:rFonts w:ascii="Calibri" w:cs="Calibri" w:eastAsia="Calibri" w:hAnsi="Calibri"/>
+      <w:i w:val="1"/>
+      <w:color w:val="2f5496"/>
+    </w:rPr>
+  </w:style>
+  <w:style w:type="paragraph" w:styleId="Heading5">
+    <w:name w:val="heading 5"/>
+    <w:basedOn w:val="Normal"/>
+    <w:next w:val="Normal"/>
+    <w:pPr>
+      <w:keepNext w:val="1"/>
+      <w:keepLines w:val="1"/>
+      <w:spacing w:after="0" w:before="40" w:lineRule="auto"/>
+    </w:pPr>
+    <w:rPr>
+      <w:rFonts w:ascii="Calibri" w:cs="Calibri" w:eastAsia="Calibri" w:hAnsi="Calibri"/>
+      <w:color w:val="2f5496"/>
+    </w:rPr>
+  </w:style>
+  <w:style w:type="paragraph" w:styleId="Heading6">
+    <w:name w:val="heading 6"/>
+    <w:basedOn w:val="Normal"/>
+    <w:next w:val="Normal"/>
+    <w:pPr>
+      <w:keepNext w:val="1"/>
+      <w:keepLines w:val="1"/>
+      <w:spacing w:after="0" w:before="40" w:lineRule="auto"/>
+    </w:pPr>
+    <w:rPr>
+      <w:rFonts w:ascii="Calibri" w:cs="Calibri" w:eastAsia="Calibri" w:hAnsi="Calibri"/>
+      <w:color w:val="1f3863"/>
+    </w:rPr>
+  </w:style>
+  <w:style w:type="paragraph" w:styleId="Title">
+    <w:name w:val="Title"/>
+    <w:basedOn w:val="Normal"/>
+    <w:next w:val="Normal"/>
+    <w:pPr>
+      <w:keepNext w:val="1"/>
+      <w:keepLines w:val="1"/>
+      <w:pageBreakBefore w:val="0"/>
+      <w:spacing w:after="120" w:before="480" w:lineRule="auto"/>
+    </w:pPr>
+    <w:rPr>
+      <w:b w:val="1"/>
+      <w:sz w:val="72"/>
+      <w:szCs w:val="72"/>
+    </w:rPr>
+  </w:style>
+  <w:style w:type="paragraph" w:styleId="Normal" w:default="1">
+    <w:name w:val="normal"/>
+  </w:style>
+  <w:style w:type="table" w:styleId="TableNormal" w:default="1">
+    <w:name w:val="Table Normal"/>
+  </w:style>
+  <w:style w:type="paragraph" w:styleId="Heading1">
+    <w:name w:val="heading 1"/>
+    <w:basedOn w:val="Normal"/>
+    <w:next w:val="Normal"/>
+    <w:pPr>
+      <w:keepNext w:val="1"/>
+      <w:keepLines w:val="1"/>
+      <w:spacing w:after="0" w:before="240" w:lineRule="auto"/>
+    </w:pPr>
+    <w:rPr>
+      <w:rFonts w:ascii="Calibri" w:cs="Calibri" w:eastAsia="Calibri" w:hAnsi="Calibri"/>
+      <w:b w:val="1"/>
+      <w:sz w:val="32"/>
+      <w:szCs w:val="32"/>
+    </w:rPr>
+  </w:style>
+  <w:style w:type="paragraph" w:styleId="Heading2">
+    <w:name w:val="heading 2"/>
+    <w:basedOn w:val="Normal"/>
+    <w:next w:val="Normal"/>
+    <w:pPr>
+      <w:keepNext w:val="1"/>
+      <w:keepLines w:val="1"/>
+      <w:spacing w:after="0" w:before="40" w:lineRule="auto"/>
+    </w:pPr>
+    <w:rPr>
+      <w:rFonts w:ascii="Calibri" w:cs="Calibri" w:eastAsia="Calibri" w:hAnsi="Calibri"/>
+      <w:color w:val="000000"/>
+      <w:sz w:val="24"/>
+      <w:szCs w:val="24"/>
+    </w:rPr>
+  </w:style>
+  <w:style w:type="paragraph" w:styleId="Heading3">
+    <w:name w:val="heading 3"/>
+    <w:basedOn w:val="Normal"/>
+    <w:next w:val="Normal"/>
+    <w:pPr>
+      <w:keepNext w:val="1"/>
+      <w:keepLines w:val="1"/>
+      <w:spacing w:after="0" w:before="40" w:lineRule="auto"/>
+    </w:pPr>
+    <w:rPr>
+      <w:rFonts w:ascii="Calibri" w:cs="Calibri" w:eastAsia="Calibri" w:hAnsi="Calibri"/>
+      <w:color w:val="1f3863"/>
+      <w:sz w:val="24"/>
+      <w:szCs w:val="24"/>
+    </w:rPr>
+  </w:style>
+  <w:style w:type="paragraph" w:styleId="Heading4">
+    <w:name w:val="heading 4"/>
+    <w:basedOn w:val="Normal"/>
+    <w:next w:val="Normal"/>
+    <w:pPr>
+      <w:keepNext w:val="1"/>
+      <w:keepLines w:val="1"/>
+      <w:spacing w:after="0" w:before="40" w:lineRule="auto"/>
+    </w:pPr>
+    <w:rPr>
+      <w:rFonts w:ascii="Calibri" w:cs="Calibri" w:eastAsia="Calibri" w:hAnsi="Calibri"/>
+      <w:i w:val="1"/>
+      <w:color w:val="2f5496"/>
+    </w:rPr>
+  </w:style>
+  <w:style w:type="paragraph" w:styleId="Heading5">
+    <w:name w:val="heading 5"/>
+    <w:basedOn w:val="Normal"/>
+    <w:next w:val="Normal"/>
+    <w:pPr>
+      <w:keepNext w:val="1"/>
+      <w:keepLines w:val="1"/>
+      <w:spacing w:after="0" w:before="40" w:lineRule="auto"/>
+    </w:pPr>
+    <w:rPr>
+      <w:rFonts w:ascii="Calibri" w:cs="Calibri" w:eastAsia="Calibri" w:hAnsi="Calibri"/>
+      <w:color w:val="2f5496"/>
+    </w:rPr>
+  </w:style>
+  <w:style w:type="paragraph" w:styleId="Heading6">
+    <w:name w:val="heading 6"/>
+    <w:basedOn w:val="Normal"/>
+    <w:next w:val="Normal"/>
+    <w:pPr>
+      <w:keepNext w:val="1"/>
+      <w:keepLines w:val="1"/>
+      <w:spacing w:after="0" w:before="40" w:lineRule="auto"/>
+    </w:pPr>
+    <w:rPr>
+      <w:rFonts w:ascii="Calibri" w:cs="Calibri" w:eastAsia="Calibri" w:hAnsi="Calibri"/>
+      <w:color w:val="1f3863"/>
+    </w:rPr>
+  </w:style>
+  <w:style w:type="paragraph" w:styleId="Title">
+    <w:name w:val="Title"/>
+    <w:basedOn w:val="Normal"/>
+    <w:next w:val="Normal"/>
+    <w:pPr>
+      <w:keepNext w:val="1"/>
+      <w:keepLines w:val="1"/>
+      <w:pageBreakBefore w:val="0"/>
+      <w:spacing w:after="120" w:before="480" w:lineRule="auto"/>
+    </w:pPr>
+    <w:rPr>
+      <w:b w:val="1"/>
+      <w:sz w:val="72"/>
+      <w:szCs w:val="72"/>
+    </w:rPr>
+  </w:style>
+  <w:style w:type="paragraph" w:styleId="Normal" w:default="1">
+    <w:name w:val="normal"/>
+  </w:style>
+  <w:style w:type="table" w:styleId="TableNormal" w:default="1">
+    <w:name w:val="Table Normal"/>
+  </w:style>
+  <w:style w:type="paragraph" w:styleId="Heading1">
+    <w:name w:val="heading 1"/>
+    <w:basedOn w:val="Normal"/>
+    <w:next w:val="Normal"/>
+    <w:pPr>
+      <w:keepNext w:val="1"/>
+      <w:keepLines w:val="1"/>
+      <w:spacing w:after="0" w:before="240" w:lineRule="auto"/>
       <w:ind w:left="432" w:hanging="432"/>
     </w:pPr>
     <w:rPr>
@@ -4845,6 +5348,78 @@
       <w:color w:val="44546a" w:themeColor="text2"/>
       <w:sz w:val="18"/>
       <w:szCs w:val="18"/>
+    </w:rPr>
+  </w:style>
+  <w:style w:type="paragraph" w:styleId="Subtitle">
+    <w:name w:val="Subtitle"/>
+    <w:basedOn w:val="Normal"/>
+    <w:next w:val="Normal"/>
+    <w:pPr>
+      <w:keepNext w:val="1"/>
+      <w:keepLines w:val="1"/>
+      <w:pageBreakBefore w:val="0"/>
+      <w:spacing w:after="80" w:before="360" w:lineRule="auto"/>
+    </w:pPr>
+    <w:rPr>
+      <w:rFonts w:ascii="Georgia" w:cs="Georgia" w:eastAsia="Georgia" w:hAnsi="Georgia"/>
+      <w:i w:val="1"/>
+      <w:color w:val="666666"/>
+      <w:sz w:val="48"/>
+      <w:szCs w:val="48"/>
+    </w:rPr>
+  </w:style>
+  <w:style w:type="paragraph" w:styleId="Subtitle">
+    <w:name w:val="Subtitle"/>
+    <w:basedOn w:val="Normal"/>
+    <w:next w:val="Normal"/>
+    <w:pPr>
+      <w:keepNext w:val="1"/>
+      <w:keepLines w:val="1"/>
+      <w:pageBreakBefore w:val="0"/>
+      <w:spacing w:after="80" w:before="360" w:lineRule="auto"/>
+    </w:pPr>
+    <w:rPr>
+      <w:rFonts w:ascii="Georgia" w:cs="Georgia" w:eastAsia="Georgia" w:hAnsi="Georgia"/>
+      <w:i w:val="1"/>
+      <w:color w:val="666666"/>
+      <w:sz w:val="48"/>
+      <w:szCs w:val="48"/>
+    </w:rPr>
+  </w:style>
+  <w:style w:type="paragraph" w:styleId="Subtitle">
+    <w:name w:val="Subtitle"/>
+    <w:basedOn w:val="Normal"/>
+    <w:next w:val="Normal"/>
+    <w:pPr>
+      <w:keepNext w:val="1"/>
+      <w:keepLines w:val="1"/>
+      <w:pageBreakBefore w:val="0"/>
+      <w:spacing w:after="80" w:before="360" w:lineRule="auto"/>
+    </w:pPr>
+    <w:rPr>
+      <w:rFonts w:ascii="Georgia" w:cs="Georgia" w:eastAsia="Georgia" w:hAnsi="Georgia"/>
+      <w:i w:val="1"/>
+      <w:color w:val="666666"/>
+      <w:sz w:val="48"/>
+      <w:szCs w:val="48"/>
+    </w:rPr>
+  </w:style>
+  <w:style w:type="paragraph" w:styleId="Subtitle">
+    <w:name w:val="Subtitle"/>
+    <w:basedOn w:val="Normal"/>
+    <w:next w:val="Normal"/>
+    <w:pPr>
+      <w:keepNext w:val="1"/>
+      <w:keepLines w:val="1"/>
+      <w:pageBreakBefore w:val="0"/>
+      <w:spacing w:after="80" w:before="360" w:lineRule="auto"/>
+    </w:pPr>
+    <w:rPr>
+      <w:rFonts w:ascii="Georgia" w:cs="Georgia" w:eastAsia="Georgia" w:hAnsi="Georgia"/>
+      <w:i w:val="1"/>
+      <w:color w:val="666666"/>
+      <w:sz w:val="48"/>
+      <w:szCs w:val="48"/>
     </w:rPr>
   </w:style>
   <w:style w:type="paragraph" w:styleId="Subtitle">
@@ -5273,7 +5848,7 @@
 
 <file path=customXML/item1.xml><?xml version="1.0" encoding="utf-8"?>
 <go:gDocsCustomXmlDataStorage xmlns:go="http://customooxmlschemas.google.com/" xmlns:r="http://schemas.openxmlformats.org/officeDocument/2006/relationships" uri="GoogleDocsCustomDataVersion2">
-  <go:docsCustomData xmlns:go="http://customooxmlschemas.google.com/" roundtripDataSignature="AMtx7mitq6uVMQCky/RuYWA5ow2DTY6s+w==">CgMxLjAyCGguZ2pkZ3hzMgloLjMwajB6bGwyCWguMWZvYjl0ZTIJaC4zZHk2dmttMgloLjF0M2g1c2YyCWguNGQzNG9nODIJaC4yczhleW8xOAByITFTdjl4UFZ0OVRHcWhrXzdtVlY3WGFTX1hWTWN6RzF0cw==</go:docsCustomData>
+  <go:docsCustomData xmlns:go="http://customooxmlschemas.google.com/" roundtripDataSignature="AMtx7miSj4yWUfiSNO7Yov4UYgF11bchZg==">CgMxLjAyCGguZ2pkZ3hzMgloLjMwajB6bGwyCWguMWZvYjl0ZTIJaC4zZHk2dmttMgloLjF0M2g1c2YyCWguNGQzNG9nODIJaC4yczhleW8xOAByITFoZ3hST3lTTXVMa25NRG9WY1k3dzNOVUFEV3puQjVzYw==</go:docsCustomData>
 </go:gDocsCustomXmlDataStorage>
 </file>
 

</xml_diff>